<commit_message>
Aplicar correcciones de datos y redacción a los cuatro casos 2026
Se corrigen incongruencias (gases, creatinina basal, examen de orina,
Glasgow), se completan datos faltantes del caso 4 y se mantienen los
errores de indicación como intencionales, declarados en el informe.

Co-Authored-By: Claude Opus 5.5 <noreply@anthropic.com>
Claude-Session: https://claude.ai/code/session_01DyBZKBk6FeGc15UXEhTrSH
</commit_message>
<xml_diff>
--- a/evaluacion-integrativa-2026/2026_Situacion_de_Enfermeria_N1.docx
+++ b/evaluacion-integrativa-2026/2026_Situacion_de_Enfermeria_N1.docx
@@ -95,22 +95,22 @@
         <w:jc w:val="both"/>
       </w:pPr>
       <w:r>
-        <w:t xml:space="preserve">Consulta porque hace 1 semana nota mayor compromiso del estado general (CEG), disnea de pequeño esfuerzo, debe dormir con almohadas en su cabecera (ortopnea) y mayor edema en extremidades inferiores. Ha tenido algunos episodios de disnea brusca en la noche (disnea paroxística nocturna), por lo cual ha tenido que levantarse de la cama para que ceda.  Consulta en servicio de urgencias donde es evaluado y se ingresa para estudio y manejo, sospechando de insuficiencia cardiaca descompensada. </w:t>
-      </w:r>
-    </w:p>
-    <w:p>
-      <w:pPr>
-        <w:spacing w:after="0"/>
-        <w:jc w:val="both"/>
-      </w:pPr>
-    </w:p>
-    <w:p>
-      <w:pPr>
-        <w:spacing w:after="0"/>
-        <w:jc w:val="both"/>
-      </w:pPr>
-      <w:r>
-        <w:t xml:space="preserve">Paciente vive con esposa y sus 2 hijos. Trabaja de manera esporádica como jardinero en un edificio cercano a su domicilio. Refiere que ha dejado de asistir a sus turnos por “sentirse muy fatigado” y ha preferido quedarse en casa. No realiza actividad física frecuente, sólo las caminatas a su trabajo cuando asiste y/o a comprar cerca del barrio. Vive de su pensión más el sueldo esporádico de su trabajo de jardinero.  Su esposa es jubilada también y trabaja cuidando niños de forma esporádica, es  HTA en tratamiento con buena adherencia a controles en CESFAM. Uno de sus hijos cursa estudios universitarios autofinanciados, y el otro cursa segundo medio en un colegio municipal, cercano a la vivienda. Refiere que son una familia unida y se dan apoyo en las situaciones difíciles.  Vive en casa solida con servicios básicos luz, agua y gas. El CESFAM queda a tres cuadras de su domicilio. </w:t>
+        <w:t xml:space="preserve">Consulta porque hace 1 semana nota mayor compromiso del estado general (CEG), disnea de pequeño esfuerzo, debe dormir con 3 almohadas en su cabecera y mayor edema en extremidades inferiores. Ha tenido algunos episodios de disnea brusca en la noche, por lo cual ha tenido que levantarse de la cama para que ceda.  Consulta en servicio de urgencias donde es evaluado y se ingresa para estudio y manejo, sospechando de insuficiencia cardiaca descompensada. </w:t>
+      </w:r>
+    </w:p>
+    <w:p>
+      <w:pPr>
+        <w:spacing w:after="0"/>
+        <w:jc w:val="both"/>
+      </w:pPr>
+    </w:p>
+    <w:p>
+      <w:pPr>
+        <w:spacing w:after="0"/>
+        <w:jc w:val="both"/>
+      </w:pPr>
+      <w:r>
+        <w:t xml:space="preserve">Paciente vive con esposa y sus 2 hijos. Trabaja de manera esporádica como jardinero en un edificio cercano a su domicilio. Refiere que ha dejado de asistir a sus turnos por “sentirse muy fatigado” y ha preferido quedarse en casa. No realiza actividad física frecuente, sólo las caminatas a su trabajo cuando asiste y/o a comprar cerca del barrio. Vive de su pensión más el sueldo esporádico de su trabajo de jardinero.  Su esposa es jubilada también y trabaja cuidando niños de forma esporádica, es  HTA en tratamiento con buena adherencia a controles en CESFAM. Uno de sus hijos cursa estudios universitarios autofinanciados, y el otro cursa segundo medio en un colegio municipal, cercano a la vivienda. Refiere que son una familia unida y se dan apoyo en las situaciones difíciles.  Vive en casa sólida con servicios básicos luz, agua y gas. El CESFAM queda a tres cuadras de su domicilio. </w:t>
       </w:r>
     </w:p>
     <w:p>
@@ -212,6 +212,58 @@
         <w:rPr>
           <w:color w:val="000000"/>
         </w:rPr>
+        <w:t xml:space="preserve">BUN: 38 mg/dL</w:t>
+      </w:r>
+    </w:p>
+    <w:p>
+      <w:pPr>
+        <w:numPr>
+          <w:ilvl w:val="0"/>
+          <w:numId w:val="1"/>
+        </w:numPr>
+        <w:pBdr>
+          <w:top w:val="nil"/>
+          <w:left w:val="nil"/>
+          <w:bottom w:val="nil"/>
+          <w:right w:val="nil"/>
+          <w:between w:val="nil"/>
+        </w:pBdr>
+        <w:spacing w:after="0"/>
+        <w:jc w:val="both"/>
+        <w:rPr>
+          <w:color w:val="000000"/>
+        </w:rPr>
+      </w:pPr>
+      <w:r>
+        <w:rPr>
+          <w:color w:val="000000"/>
+        </w:rPr>
+        <w:t xml:space="preserve">Hemoglobina: 11,8 g/dL</w:t>
+      </w:r>
+    </w:p>
+    <w:p>
+      <w:pPr>
+        <w:numPr>
+          <w:ilvl w:val="0"/>
+          <w:numId w:val="1"/>
+        </w:numPr>
+        <w:pBdr>
+          <w:top w:val="nil"/>
+          <w:left w:val="nil"/>
+          <w:bottom w:val="nil"/>
+          <w:right w:val="nil"/>
+          <w:between w:val="nil"/>
+        </w:pBdr>
+        <w:spacing w:after="0"/>
+        <w:jc w:val="both"/>
+        <w:rPr>
+          <w:color w:val="000000"/>
+        </w:rPr>
+      </w:pPr>
+      <w:r>
+        <w:rPr>
+          <w:color w:val="000000"/>
+        </w:rPr>
         <w:t xml:space="preserve">Kalemia: </w:t>
       </w:r>
       <w:r>
@@ -242,7 +294,7 @@
       </w:pPr>
       <w:r>
         <w:lastRenderedPageBreak/>
-        <w:t xml:space="preserve">Pro-Bnp: 1.890 pg/ml</w:t>
+        <w:t xml:space="preserve">NT-proBNP: 1.890 pg/mL</w:t>
       </w:r>
     </w:p>
     <w:p>
@@ -340,7 +392,7 @@
         <w:jc w:val="both"/>
       </w:pPr>
       <w:r>
-        <w:t>Ecocardiograma con FEVI 40%</w:t>
+        <w:t>Ecocardiograma con FEVI 35%</w:t>
       </w:r>
     </w:p>
     <w:p>
@@ -490,23 +542,23 @@
         <w:jc w:val="both"/>
       </w:pPr>
       <w:r>
-        <w:t xml:space="preserve">Se recibe a paciente en servicio de medicina, vigil, cooperador, conectado en tiempo y espacio, obedece órdenes simples, Glasgow 15/15. No refiere dolor ni molestias, sin vómitos ni náuseas, régimen alimenticio bien tolerado. Saturando 94%  con 1 lts de O2 por NRC, se mantiene con taquipnea leve, refiere disnea menor que al ingreso. El examen físico destaca mucosas hidratadas e indemnes, piel tibia y pálida. Pupilas isocóricas RFM (+). EESS moviliza (+), pulsos (+) radiales bilaterales, conserva fuerza, no se observan lesiones, VVP #20 en ESD sellada sin signos de flebitis con apósito protector FLS. Llene capilar conservado. Tórax simétrico apremio ventilatorio sin uso de musculatura accesoria, MP (+) disminuido en bases, con leves estertores, tos (+) húmeda productiva. ABDI a la palpación RHA (+), región dorsal sin alteraciones, puntos de apoyo sanos., EEII movilidad y fuerza conservada, se observa edema (++), fóvea (+),  bien perfundidas, sin lesiones. Se instala sonda Foley #14 para control de diuresis estricta, se observa salida de orinas claras, 1000 cc en 12 horas. Refiere haber tenido deposiciones el día de ayer. No se observan LPP. </w:t>
-      </w:r>
-    </w:p>
-    <w:p>
-      <w:pPr>
-        <w:jc w:val="both"/>
-      </w:pPr>
-      <w:r>
-        <w:t>AR de caídas</w:t>
-      </w:r>
-    </w:p>
-    <w:p>
-      <w:pPr>
-        <w:jc w:val="both"/>
-      </w:pPr>
-      <w:r>
-        <w:t>CR de LPP</w:t>
+        <w:t xml:space="preserve">Se recibe a paciente en servicio de medicina, vigil, cooperador, conectado en tiempo y espacio, obedece órdenes simples, Glasgow 15/15. No refiere dolor ni molestias, sin vómitos ni náuseas, régimen alimenticio bien tolerado. Saturando 94%  con 1 lts de O2 por NRC, se mantiene con taquipnea leve, refiere disnea menor que al ingreso. El examen físico destaca mucosas hidratadas e indemnes, piel tibia y pálida. Pupilas isocóricas RFM (+). EESS moviliza (+), pulsos (+) radiales bilaterales, conserva fuerza, no se observan lesiones, VVP #20 en ESD sellada sin signos de flebitis con apósito protector FLS. Llene capilar conservado. Tórax simétrico apremio ventilatorio sin uso de musculatura accesoria, MP (+) disminuido en bases, con leves estertores, tos (+) húmeda productiva. Abdomen blando, depresible e indoloro a la palpación, RHA (+), región dorsal sin alteraciones, puntos de apoyo sanos., EEII movilidad y fuerza conservada, se observa edema (++), fóvea (+),  bien perfundidas, sin lesiones. Se instala sonda Foley #14 para control de diuresis estricta, se observa salida de orinas claras, 1000 cc en 12 horas. Refiere haber tenido deposiciones el día de ayer. No se observan LPP. </w:t>
+      </w:r>
+    </w:p>
+    <w:p>
+      <w:pPr>
+        <w:jc w:val="both"/>
+      </w:pPr>
+      <w:r>
+        <w:t>Alto riesgo de caídas (escala de Downton: 3 puntos)</w:t>
+      </w:r>
+    </w:p>
+    <w:p>
+      <w:pPr>
+        <w:jc w:val="both"/>
+      </w:pPr>
+      <w:r>
+        <w:t>Riesgo bajo de LPP (escala de Braden: 15 puntos)</w:t>
       </w:r>
     </w:p>
     <w:p>

</xml_diff>